<commit_message>
refactor: documentar y reforzar el proyecto final
</commit_message>
<xml_diff>
--- a/docs/Documentacion_Origen_Tico.docx
+++ b/docs/Documentacion_Origen_Tico.docx
@@ -458,7 +458,7 @@
               <w:spacing w:after="0"/>
             </w:pPr>
             <w:r>
-              <w:t>La batería automatizada contiene 16 pruebas con 63 aserciones. La aplicación también fue ejecutada contra MariaDB de XAMPP y revisada visualmente en escritorio y móvil.</w:t>
+              <w:t>La batería automatizada contiene 17 pruebas con 67 aserciones. La aplicación también fue ejecutada contra MariaDB de XAMPP y revisada visualmente en escritorio y móvil.</w:t>
             </w:r>
           </w:p>
         </w:tc>
@@ -4568,7 +4568,7 @@
                 <w:color w:val="17251D"/>
                 <w:sz w:val="18"/>
               </w:rPr>
-              <w:t>16 pruebas, 63 aserciones.</w:t>
+              <w:t>17 pruebas, 67 aserciones.</w:t>
             </w:r>
           </w:p>
         </w:tc>

</xml_diff>

<commit_message>
test: endurecer el proyecto para lanzamiento
</commit_message>
<xml_diff>
--- a/docs/Documentacion_Origen_Tico.docx
+++ b/docs/Documentacion_Origen_Tico.docx
@@ -458,7 +458,7 @@
               <w:spacing w:after="0"/>
             </w:pPr>
             <w:r>
-              <w:t>La batería automatizada contiene 17 pruebas con 67 aserciones. La aplicación también fue ejecutada contra MariaDB de XAMPP y revisada visualmente en escritorio y móvil.</w:t>
+              <w:t>La batería automatizada contiene 43 pruebas con 197 aserciones aprobadas tanto en SQLite como en MariaDB temporal de XAMPP. También se verificaron formato y cachés de producción.</w:t>
             </w:r>
           </w:p>
         </w:tc>
@@ -1072,7 +1072,7 @@
         <w:t xml:space="preserve">Servicios: </w:t>
       </w:r>
       <w:r>
-        <w:t>CartService concentra cálculos y PdfService genera documentos.</w:t>
+        <w:t>Carrito, PDF, pagos simulados, productos recientes y estados de pedido.</w:t>
       </w:r>
     </w:p>
     <w:p>
@@ -1684,6 +1684,14 @@
         <w:pStyle w:val="ListBullet"/>
       </w:pPr>
       <w:r>
+        <w:t>Cancelación idempotente con reembolso simulado y devolución de inventario.</w:t>
+      </w:r>
+    </w:p>
+    <w:p>
+      <w:pPr>
+        <w:pStyle w:val="ListBullet"/>
+      </w:pPr>
+      <w:r>
         <w:t>Reportes PDF de ventas por mes y por cliente.</w:t>
       </w:r>
     </w:p>
@@ -2082,7 +2090,7 @@
                 <w:color w:val="17251D"/>
                 <w:sz w:val="18"/>
               </w:rPr>
-              <w:t>No se almacenan número completo ni CVV; solo referencia y cuatro dígitos.</w:t>
+              <w:t>No se almacenan ni se conservan en sesión; solo referencia y cuatro dígitos.</w:t>
             </w:r>
           </w:p>
         </w:tc>
@@ -2163,6 +2171,59 @@
                 <w:color w:val="17251D"/>
                 <w:sz w:val="18"/>
               </w:rPr>
+              <w:t>Navegador</w:t>
+            </w:r>
+          </w:p>
+        </w:tc>
+        <w:tc>
+          <w:tcPr>
+            <w:tcW w:type="dxa" w:w="6760"/>
+            <w:vAlign w:val="center"/>
+            <w:tcMar>
+              <w:top w:w="80" w:type="dxa"/>
+              <w:start w:w="120" w:type="dxa"/>
+              <w:bottom w:w="80" w:type="dxa"/>
+              <w:end w:w="120" w:type="dxa"/>
+            </w:tcMar>
+          </w:tcPr>
+          <w:p>
+            <w:pPr>
+              <w:spacing w:after="0" w:line="276" w:lineRule="auto"/>
+            </w:pPr>
+            <w:r>
+              <w:rPr>
+                <w:rFonts w:ascii="Calibri" w:hAnsi="Calibri"/>
+                <w:color w:val="17251D"/>
+                <w:sz w:val="18"/>
+              </w:rPr>
+              <w:t>CSP, anti-frame, nosniff, Referrer Policy y páginas privadas sin caché.</w:t>
+            </w:r>
+          </w:p>
+        </w:tc>
+      </w:tr>
+      <w:tr>
+        <w:tc>
+          <w:tcPr>
+            <w:tcW w:type="dxa" w:w="2600"/>
+            <w:vAlign w:val="center"/>
+            <w:tcMar>
+              <w:top w:w="80" w:type="dxa"/>
+              <w:start w:w="120" w:type="dxa"/>
+              <w:bottom w:w="80" w:type="dxa"/>
+              <w:end w:w="120" w:type="dxa"/>
+            </w:tcMar>
+          </w:tcPr>
+          <w:p>
+            <w:pPr>
+              <w:spacing w:after="0" w:line="276" w:lineRule="auto"/>
+              <w:jc w:val="center"/>
+            </w:pPr>
+            <w:r>
+              <w:rPr>
+                <w:rFonts w:ascii="Calibri" w:hAnsi="Calibri"/>
+                <w:color w:val="17251D"/>
+                <w:sz w:val="18"/>
+              </w:rPr>
               <w:t>Transporte</w:t>
             </w:r>
           </w:p>
@@ -2188,7 +2249,7 @@
                 <w:color w:val="17251D"/>
                 <w:sz w:val="18"/>
               </w:rPr>
-              <w:t>HTTPS forzado en producción y HSTS cuando la solicitud es segura.</w:t>
+              <w:t>HTTPS forzado en producción, HSTS y cookie Secure en el perfil productivo.</w:t>
             </w:r>
           </w:p>
         </w:tc>
@@ -2627,6 +2688,165 @@
                 <w:color w:val="17251D"/>
                 <w:sz w:val="18"/>
               </w:rPr>
+              <w:t>EndToEndPurchaseTest</w:t>
+            </w:r>
+          </w:p>
+        </w:tc>
+        <w:tc>
+          <w:tcPr>
+            <w:tcW w:type="dxa" w:w="6660"/>
+            <w:vAlign w:val="center"/>
+            <w:tcMar>
+              <w:top w:w="80" w:type="dxa"/>
+              <w:start w:w="120" w:type="dxa"/>
+              <w:bottom w:w="80" w:type="dxa"/>
+              <w:end w:w="120" w:type="dxa"/>
+            </w:tcMar>
+          </w:tcPr>
+          <w:p>
+            <w:pPr>
+              <w:spacing w:after="0" w:line="276" w:lineRule="auto"/>
+            </w:pPr>
+            <w:r>
+              <w:rPr>
+                <w:rFonts w:ascii="Calibri" w:hAnsi="Calibri"/>
+                <w:color w:val="17251D"/>
+                <w:sz w:val="18"/>
+              </w:rPr>
+              <w:t>Registro hasta factura e historial en una sesión.</w:t>
+            </w:r>
+          </w:p>
+        </w:tc>
+      </w:tr>
+      <w:tr>
+        <w:tc>
+          <w:tcPr>
+            <w:tcW w:type="dxa" w:w="2700"/>
+            <w:vAlign w:val="center"/>
+            <w:tcMar>
+              <w:top w:w="80" w:type="dxa"/>
+              <w:start w:w="120" w:type="dxa"/>
+              <w:bottom w:w="80" w:type="dxa"/>
+              <w:end w:w="120" w:type="dxa"/>
+            </w:tcMar>
+          </w:tcPr>
+          <w:p>
+            <w:pPr>
+              <w:spacing w:after="0" w:line="276" w:lineRule="auto"/>
+              <w:jc w:val="center"/>
+            </w:pPr>
+            <w:r>
+              <w:rPr>
+                <w:rFonts w:ascii="Calibri" w:hAnsi="Calibri"/>
+                <w:color w:val="17251D"/>
+                <w:sz w:val="18"/>
+              </w:rPr>
+              <w:t>OrderManagementTest</w:t>
+            </w:r>
+          </w:p>
+        </w:tc>
+        <w:tc>
+          <w:tcPr>
+            <w:tcW w:type="dxa" w:w="6660"/>
+            <w:vAlign w:val="center"/>
+            <w:tcMar>
+              <w:top w:w="80" w:type="dxa"/>
+              <w:start w:w="120" w:type="dxa"/>
+              <w:bottom w:w="80" w:type="dxa"/>
+              <w:end w:w="120" w:type="dxa"/>
+            </w:tcMar>
+          </w:tcPr>
+          <w:p>
+            <w:pPr>
+              <w:spacing w:after="0" w:line="276" w:lineRule="auto"/>
+            </w:pPr>
+            <w:r>
+              <w:rPr>
+                <w:rFonts w:ascii="Calibri" w:hAnsi="Calibri"/>
+                <w:color w:val="17251D"/>
+                <w:sz w:val="18"/>
+              </w:rPr>
+              <w:t>Estados, cancelación, pago e inventario.</w:t>
+            </w:r>
+          </w:p>
+        </w:tc>
+      </w:tr>
+      <w:tr>
+        <w:tc>
+          <w:tcPr>
+            <w:tcW w:type="dxa" w:w="2700"/>
+            <w:vAlign w:val="center"/>
+            <w:tcMar>
+              <w:top w:w="80" w:type="dxa"/>
+              <w:start w:w="120" w:type="dxa"/>
+              <w:bottom w:w="80" w:type="dxa"/>
+              <w:end w:w="120" w:type="dxa"/>
+            </w:tcMar>
+          </w:tcPr>
+          <w:p>
+            <w:pPr>
+              <w:spacing w:after="0" w:line="276" w:lineRule="auto"/>
+              <w:jc w:val="center"/>
+            </w:pPr>
+            <w:r>
+              <w:rPr>
+                <w:rFonts w:ascii="Calibri" w:hAnsi="Calibri"/>
+                <w:color w:val="17251D"/>
+                <w:sz w:val="18"/>
+              </w:rPr>
+              <w:t>SecurityHardeningTest</w:t>
+            </w:r>
+          </w:p>
+        </w:tc>
+        <w:tc>
+          <w:tcPr>
+            <w:tcW w:type="dxa" w:w="6660"/>
+            <w:vAlign w:val="center"/>
+            <w:tcMar>
+              <w:top w:w="80" w:type="dxa"/>
+              <w:start w:w="120" w:type="dxa"/>
+              <w:bottom w:w="80" w:type="dxa"/>
+              <w:end w:w="120" w:type="dxa"/>
+            </w:tcMar>
+          </w:tcPr>
+          <w:p>
+            <w:pPr>
+              <w:spacing w:after="0" w:line="276" w:lineRule="auto"/>
+            </w:pPr>
+            <w:r>
+              <w:rPr>
+                <w:rFonts w:ascii="Calibri" w:hAnsi="Calibri"/>
+                <w:color w:val="17251D"/>
+                <w:sz w:val="18"/>
+              </w:rPr>
+              <w:t>CSP, HSTS, permisos y caché privada.</w:t>
+            </w:r>
+          </w:p>
+        </w:tc>
+      </w:tr>
+      <w:tr>
+        <w:tc>
+          <w:tcPr>
+            <w:tcW w:type="dxa" w:w="2700"/>
+            <w:vAlign w:val="center"/>
+            <w:tcMar>
+              <w:top w:w="80" w:type="dxa"/>
+              <w:start w:w="120" w:type="dxa"/>
+              <w:bottom w:w="80" w:type="dxa"/>
+              <w:end w:w="120" w:type="dxa"/>
+            </w:tcMar>
+          </w:tcPr>
+          <w:p>
+            <w:pPr>
+              <w:spacing w:after="0" w:line="276" w:lineRule="auto"/>
+              <w:jc w:val="center"/>
+            </w:pPr>
+            <w:r>
+              <w:rPr>
+                <w:rFonts w:ascii="Calibri" w:hAnsi="Calibri"/>
+                <w:color w:val="17251D"/>
+                <w:sz w:val="18"/>
+              </w:rPr>
               <w:t>ProfileAndReportsTest</w:t>
             </w:r>
           </w:p>
@@ -2905,7 +3125,7 @@
                 <w:color w:val="17251D"/>
                 <w:sz w:val="18"/>
               </w:rPr>
-              <w:t>Carpeta ProyectoFinal-NombreEstudiantes</w:t>
+              <w:t>Carpeta ProyectoFinalNombreEstudiantes</w:t>
             </w:r>
           </w:p>
         </w:tc>
@@ -2930,7 +3150,7 @@
                 <w:color w:val="17251D"/>
                 <w:sz w:val="18"/>
               </w:rPr>
-              <w:t>ZIP generado con nombre solicitado.</w:t>
+              <w:t>ZIP generado con el formato solicitado.</w:t>
             </w:r>
           </w:p>
         </w:tc>
@@ -4568,7 +4788,7 @@
                 <w:color w:val="17251D"/>
                 <w:sz w:val="18"/>
               </w:rPr>
-              <w:t>17 pruebas, 67 aserciones.</w:t>
+              <w:t>43 pruebas, 197 aserciones; SQLite y MariaDB.</w:t>
             </w:r>
           </w:p>
         </w:tc>

</xml_diff>

<commit_message>
fix: corregir catalogo y reforzar auditoria
</commit_message>
<xml_diff>
--- a/docs/Documentacion_Origen_Tico.docx
+++ b/docs/Documentacion_Origen_Tico.docx
@@ -458,7 +458,7 @@
               <w:spacing w:after="0"/>
             </w:pPr>
             <w:r>
-              <w:t>La batería automatizada contiene 43 pruebas con 197 aserciones aprobadas tanto en SQLite como en MariaDB temporal de XAMPP. También se verificaron formato y cachés de producción.</w:t>
+              <w:t>La batería automatizada contiene 48 pruebas con 233 aserciones aprobadas tanto en SQLite como en MariaDB temporal de XAMPP. También se verificaron formato, cachés de producción y dependencias.</w:t>
             </w:r>
           </w:p>
         </w:tc>
@@ -811,7 +811,7 @@
                 <w:color w:val="17251D"/>
                 <w:sz w:val="18"/>
               </w:rPr>
-              <w:t>Dompdf para factura y ventas por mes o cliente.</w:t>
+              <w:t>Dompdf 3.1.6 para factura y ventas por mes o cliente.</w:t>
             </w:r>
           </w:p>
         </w:tc>
@@ -1001,6 +1001,59 @@
       <w:pPr>
         <w:spacing w:after="0"/>
       </w:pPr>
+    </w:p>
+    <w:p>
+      <w:pPr>
+        <w:pStyle w:val="Heading2"/>
+      </w:pPr>
+      <w:r>
+        <w:t>Comprobación con SQLite</w:t>
+      </w:r>
+    </w:p>
+    <w:p>
+      <w:r>
+        <w:t>La demostración principal utiliza MariaDB de XAMPP, pero la consigna escrita menciona SQLite. El sistema completo puede ejecutarse con ese motor sin modificar origen_tico.</w:t>
+      </w:r>
+    </w:p>
+    <w:p>
+      <w:pPr>
+        <w:pStyle w:val="ListNumber"/>
+      </w:pPr>
+      <w:r>
+        <w:t>Respaldar el entorno con Copy-Item .env .env.backup.</w:t>
+      </w:r>
+    </w:p>
+    <w:p>
+      <w:pPr>
+        <w:pStyle w:val="ListNumber"/>
+      </w:pPr>
+      <w:r>
+        <w:t>Copiar .env.sqlite.example a .env con el parámetro -Force.</w:t>
+      </w:r>
+    </w:p>
+    <w:p>
+      <w:pPr>
+        <w:pStyle w:val="ListNumber"/>
+      </w:pPr>
+      <w:r>
+        <w:t>Crear database/database.sqlite si todavía no existe.</w:t>
+      </w:r>
+    </w:p>
+    <w:p>
+      <w:pPr>
+        <w:pStyle w:val="ListNumber"/>
+      </w:pPr>
+      <w:r>
+        <w:t>Ejecutar php artisan key:generate, php artisan migrate --seed y php artisan serve.</w:t>
+      </w:r>
+    </w:p>
+    <w:p>
+      <w:pPr>
+        <w:pStyle w:val="ListNumber"/>
+      </w:pPr>
+      <w:r>
+        <w:t>Restaurar .env.backup al terminar y ejecutar php artisan optimize:clear.</w:t>
+      </w:r>
     </w:p>
     <w:p>
       <w:pPr>
@@ -1652,7 +1705,15 @@
         <w:pStyle w:val="ListBullet"/>
       </w:pPr>
       <w:r>
-        <w:t>IVA de 13 %, envío de CRC 2.500 y envío gratis desde CRC 30.000.</w:t>
+        <w:t>IVA de 13 %, envío de CRC 2.500 y envío gratis desde CRC 20.000.</w:t>
+      </w:r>
+    </w:p>
+    <w:p>
+      <w:pPr>
+        <w:pStyle w:val="ListBullet"/>
+      </w:pPr>
+      <w:r>
+        <w:t>Chocolate oscuro 82 % y caja de las ocho regiones cafetaleras de Costa Rica.</w:t>
       </w:r>
     </w:p>
     <w:p>
@@ -2254,6 +2315,59 @@
           </w:p>
         </w:tc>
       </w:tr>
+      <w:tr>
+        <w:tc>
+          <w:tcPr>
+            <w:tcW w:type="dxa" w:w="2600"/>
+            <w:vAlign w:val="center"/>
+            <w:tcMar>
+              <w:top w:w="80" w:type="dxa"/>
+              <w:start w:w="120" w:type="dxa"/>
+              <w:bottom w:w="80" w:type="dxa"/>
+              <w:end w:w="120" w:type="dxa"/>
+            </w:tcMar>
+          </w:tcPr>
+          <w:p>
+            <w:pPr>
+              <w:spacing w:after="0" w:line="276" w:lineRule="auto"/>
+              <w:jc w:val="center"/>
+            </w:pPr>
+            <w:r>
+              <w:rPr>
+                <w:rFonts w:ascii="Calibri" w:hAnsi="Calibri"/>
+                <w:color w:val="17251D"/>
+                <w:sz w:val="18"/>
+              </w:rPr>
+              <w:t>Dependencias</w:t>
+            </w:r>
+          </w:p>
+        </w:tc>
+        <w:tc>
+          <w:tcPr>
+            <w:tcW w:type="dxa" w:w="6760"/>
+            <w:vAlign w:val="center"/>
+            <w:tcMar>
+              <w:top w:w="80" w:type="dxa"/>
+              <w:start w:w="120" w:type="dxa"/>
+              <w:bottom w:w="80" w:type="dxa"/>
+              <w:end w:w="120" w:type="dxa"/>
+            </w:tcMar>
+          </w:tcPr>
+          <w:p>
+            <w:pPr>
+              <w:spacing w:after="0" w:line="276" w:lineRule="auto"/>
+            </w:pPr>
+            <w:r>
+              <w:rPr>
+                <w:rFonts w:ascii="Calibri" w:hAnsi="Calibri"/>
+                <w:color w:val="17251D"/>
+                <w:sz w:val="18"/>
+              </w:rPr>
+              <w:t>Dompdf 3.1.6 y composer audit sin avisos conocidos.</w:t>
+            </w:r>
+          </w:p>
+        </w:tc>
+      </w:tr>
     </w:tbl>
     <w:p>
       <w:pPr>
@@ -2554,7 +2668,7 @@
                 <w:color w:val="17251D"/>
                 <w:sz w:val="18"/>
               </w:rPr>
-              <w:t>Filtros, cookie y XSS.</w:t>
+              <w:t>Filtros, cookie, XSS y datos reales del catálogo.</w:t>
             </w:r>
           </w:p>
         </w:tc>
@@ -3618,7 +3732,7 @@
                 <w:color w:val="17251D"/>
                 <w:sz w:val="18"/>
               </w:rPr>
-              <w:t>Ocho productos con SVG local.</w:t>
+              <w:t>Ocho productos con fotografías locales.</w:t>
             </w:r>
           </w:p>
         </w:tc>
@@ -4320,7 +4434,7 @@
                 <w:color w:val="17251D"/>
                 <w:sz w:val="18"/>
               </w:rPr>
-              <w:t>Bootstrap, CSS propio y SVG.</w:t>
+              <w:t>Bootstrap, CSS propio y fotografías reales.</w:t>
             </w:r>
           </w:p>
         </w:tc>
@@ -4788,7 +4902,7 @@
                 <w:color w:val="17251D"/>
                 <w:sz w:val="18"/>
               </w:rPr>
-              <w:t>43 pruebas, 197 aserciones; SQLite y MariaDB.</w:t>
+              <w:t>48 pruebas, 233 aserciones; SQLite y MariaDB.</w:t>
             </w:r>
           </w:p>
         </w:tc>
@@ -5490,7 +5604,7 @@
                 <w:color w:val="17251D"/>
                 <w:sz w:val="18"/>
               </w:rPr>
-              <w:t>Git, .gitignore y workflow de CI; asociar remoto del equipo.</w:t>
+              <w:t>Repositorio Byroncha1323/origen-tico, .gitignore y workflow de CI.</w:t>
             </w:r>
           </w:p>
         </w:tc>
@@ -5508,6 +5622,64 @@
       <w:r>
         <w:t>11. Exposición y operación</w:t>
       </w:r>
+    </w:p>
+    <w:tbl>
+      <w:tblPr>
+        <w:tblStyle w:val="TableGrid"/>
+        <w:tblW w:type="dxa" w:w="9360"/>
+        <w:jc w:val="left"/>
+        <w:tblLayout w:type="fixed"/>
+        <w:tblLook w:firstColumn="1" w:firstRow="1" w:lastColumn="0" w:lastRow="0" w:noHBand="0" w:noVBand="1" w:val="04A0"/>
+        <w:tblInd w:w="120" w:type="dxa"/>
+      </w:tblPr>
+      <w:tblGrid>
+        <w:gridCol w:w="9360"/>
+      </w:tblGrid>
+      <w:tr>
+        <w:trPr>
+          <w:tblHeader w:val="true"/>
+        </w:trPr>
+        <w:tc>
+          <w:tcPr>
+            <w:tcW w:type="dxa" w:w="9360"/>
+            <w:shd w:fill="E7F0E9"/>
+            <w:vAlign w:val="center"/>
+            <w:tcMar>
+              <w:top w:w="80" w:type="dxa"/>
+              <w:start w:w="120" w:type="dxa"/>
+              <w:bottom w:w="80" w:type="dxa"/>
+              <w:end w:w="120" w:type="dxa"/>
+            </w:tcMar>
+          </w:tcPr>
+          <w:p>
+            <w:pPr>
+              <w:spacing w:after="60"/>
+            </w:pPr>
+            <w:r>
+              <w:rPr>
+                <w:rFonts w:ascii="Calibri" w:hAnsi="Calibri"/>
+                <w:b/>
+                <w:color w:val="1F6847"/>
+                <w:sz w:val="21"/>
+              </w:rPr>
+              <w:t>Prevención de sanciones</w:t>
+            </w:r>
+          </w:p>
+          <w:p>
+            <w:pPr>
+              <w:spacing w:after="0"/>
+            </w:pPr>
+            <w:r>
+              <w:t>No responder al menos el 50 % de las preguntas puede anular hasta el 75 % del valor del proyecto. Cada integrante debe comprender y demostrar su módulo. La asistencia de Codex se declara y se acompaña con adaptación, pruebas, historial Git y documentación; ocultarla no demuestra autoría.</w:t>
+            </w:r>
+          </w:p>
+        </w:tc>
+      </w:tr>
+    </w:tbl>
+    <w:p>
+      <w:pPr>
+        <w:spacing w:after="0"/>
+      </w:pPr>
     </w:p>
     <w:p>
       <w:pPr>
@@ -5848,8 +6020,66 @@
     </w:p>
     <w:p>
       <w:r>
-        <w:t>La asistencia y respuestas de la exposición son responsabilidad del equipo. Publicar en un hosting, crear el repositorio remoto y emitir el certificado requieren las cuentas del equipo; el código, workflow y procedimiento están preparados.</w:t>
+        <w:t>La asistencia y respuestas de la exposición son responsabilidad del equipo. El repositorio privado ya está publicado. El hosting público y el certificado todavía requieren una cuenta, un dominio y la configuración final del equipo.</w:t>
       </w:r>
+    </w:p>
+    <w:tbl>
+      <w:tblPr>
+        <w:tblStyle w:val="TableGrid"/>
+        <w:tblW w:type="dxa" w:w="9360"/>
+        <w:jc w:val="left"/>
+        <w:tblLayout w:type="fixed"/>
+        <w:tblLook w:firstColumn="1" w:firstRow="1" w:lastColumn="0" w:lastRow="0" w:noHBand="0" w:noVBand="1" w:val="04A0"/>
+        <w:tblInd w:w="120" w:type="dxa"/>
+      </w:tblPr>
+      <w:tblGrid>
+        <w:gridCol w:w="9360"/>
+      </w:tblGrid>
+      <w:tr>
+        <w:trPr>
+          <w:tblHeader w:val="true"/>
+        </w:trPr>
+        <w:tc>
+          <w:tcPr>
+            <w:tcW w:type="dxa" w:w="9360"/>
+            <w:shd w:fill="E7F0E9"/>
+            <w:vAlign w:val="center"/>
+            <w:tcMar>
+              <w:top w:w="80" w:type="dxa"/>
+              <w:start w:w="120" w:type="dxa"/>
+              <w:bottom w:w="80" w:type="dxa"/>
+              <w:end w:w="120" w:type="dxa"/>
+            </w:tcMar>
+          </w:tcPr>
+          <w:p>
+            <w:pPr>
+              <w:spacing w:after="60"/>
+            </w:pPr>
+            <w:r>
+              <w:rPr>
+                <w:rFonts w:ascii="Calibri" w:hAnsi="Calibri"/>
+                <w:b/>
+                <w:color w:val="1F6847"/>
+                <w:sz w:val="21"/>
+              </w:rPr>
+              <w:t>Antes de entregar</w:t>
+            </w:r>
+          </w:p>
+          <w:p>
+            <w:pPr>
+              <w:spacing w:after="0"/>
+            </w:pPr>
+            <w:r>
+              <w:t>Reemplazar [Reemplazar por nombres completos] en la portada y sustituir NombreEstudiantes en el nombre del ZIP por los nombres o apellidos reales del equipo.</w:t>
+            </w:r>
+          </w:p>
+        </w:tc>
+      </w:tr>
+    </w:tbl>
+    <w:p>
+      <w:pPr>
+        <w:spacing w:after="0"/>
+      </w:pPr>
     </w:p>
     <w:sectPr>
       <w:headerReference w:type="default" r:id="rId9"/>

</xml_diff>

<commit_message>
test: validar recorrido humano y proteger acceso
</commit_message>
<xml_diff>
--- a/docs/Documentacion_Origen_Tico.docx
+++ b/docs/Documentacion_Origen_Tico.docx
@@ -458,7 +458,7 @@
               <w:spacing w:after="0"/>
             </w:pPr>
             <w:r>
-              <w:t>La batería automatizada contiene 48 pruebas con 233 aserciones aprobadas tanto en SQLite como en MariaDB temporal de XAMPP. También se verificaron formato, cachés de producción y dependencias.</w:t>
+              <w:t>La batería automatizada contiene 49 pruebas con 237 aserciones aprobadas tanto en SQLite como en MariaDB temporal de XAMPP. También se verificaron formato, cachés de producción y dependencias.</w:t>
             </w:r>
           </w:p>
         </w:tc>
@@ -4902,7 +4902,7 @@
                 <w:color w:val="17251D"/>
                 <w:sz w:val="18"/>
               </w:rPr>
-              <w:t>48 pruebas, 233 aserciones; SQLite y MariaDB.</w:t>
+              <w:t>49 pruebas, 237 aserciones; SQLite y MariaDB.</w:t>
             </w:r>
           </w:p>
         </w:tc>

</xml_diff>